<commit_message>
docs(e2): completar el diccionario de datos y limpiar restos de Markdown
Atiende dos criterios de la plenaria P3 que restaban puntos:

- «Diccionario de datos en el documento: una tabla por entidad principal, no
  solo la primera». El documento detallaba únicamente la colección lecturas y
  describía las otras cinco en prosa. Se incorporan las tablas de
  modulos_cultivo, perfiles_cultivo, rangos, alertas y usuarios, con los campos,
  tipos y restricciones tomados de los esquemas reales del servicio. Las
  leyendas posteriores se renumeran en consecuencia.

- «El documento no tiene restos». Se eliminan las marcas de Markdown que
  quedaban como caracteres literales: los asteriscos de negrita de una leyenda
  y los acentos graves de tres descripciones.

El entregable pasa de 47 a 54 páginas.
</commit_message>
<xml_diff>
--- a/docs/Santos_Perfil_Proyecto_E2.docx
+++ b/docs/Santos_Perfil_Proyecto_E2.docx
@@ -6295,7 +6295,7 @@
           <w:sz w:val="20"/>
           <w:szCs w:val="20"/>
         </w:rPr>
-        <w:t>Tabla 9. Capacidades declaradas fuera de alcance (Won't) o diferidas (Could). Fuente: elaboración propia. Las tres primeras filas quedan excluidas de esta gestión; las dos últimas —la notificación de alertas por correo y la exportación a Excel y PDF— se declaran **diferidas**: no se desarrollan en esta entrega y quedan como trabajo futuro, junto con la exportación en CSV que ya cubre RF-13.</w:t>
+        <w:t>Tabla 9. Capacidades declaradas fuera de alcance (Won't) o diferidas (Could). Fuente: elaboración propia. Las tres primeras filas quedan excluidas de esta gestión; las dos últimas —la notificación de alertas por correo y la exportación a Excel y PDF— se declaran diferidas: no se desarrollan en esta entrega y quedan como trabajo futuro, junto con la exportación en CSV que ya cubre RF-13.</w:t>
       </w:r>
     </w:p>
     <w:p>
@@ -8870,7 +8870,7 @@
           </w:tcPr>
           <w:p>
             <w:r>
-              <w:t>El campo `registrado_por` guarda el identificador del usuario que realizó la medición manual; lo resuelve el servidor a partir de la sesión y queda nulo cuando la lectura la envió el módulo de adquisición, porque entonces la lectura queda identificada por su módulo y su origen automático (RNF-08).</w:t>
+              <w:t>El campo registrado_por guarda el identificador del usuario que realizó la medición manual; lo resuelve el servidor a partir de la sesión y queda nulo cuando la lectura la envió el módulo de adquisición, porque entonces la lectura queda identificada por su módulo y su origen automático (RNF-08).</w:t>
             </w:r>
           </w:p>
         </w:tc>
@@ -9260,7 +9260,2737 @@
     <w:p>
       <w:pPr/>
       <w:r>
-        <w:t>Las demás colecciones del modelo documental. La Tabla 11 detalla la colección `lecturas`, que es la de mayor volumen y la que concentra las reglas de validación. Las otras colecciones se describen a continuación con sus campos: `modulos_cultivo` —`nombre`, `tipo_cultivo`, `perfil_id`, `ubicacion`, `activo`— identifica cada zona de cultivo y el perfil del que toma los rangos con que se evalúan sus lecturas; `perfiles_cultivo` —`nombre`, `descripcion`, `predefinido`—; `rangos` —`perfil_id`, `variable`, `minimo`, `maximo`— fija los límites de cada variable por perfil, con el mínimo menor que el máximo; `alertas` —`lectura_id`, `modulo_id`, `variable`, `valor`, `unidad`, `rango_minimo`, `rango_maximo`, `desviacion`, `estado`, `atendida_en`— referencia la lectura que la originó y copia sus datos de identificación, con los límites vigentes en ese momento; y `usuarios` —`email`, `nombre`, `rol`, `activo`, `telefono`, `cargo`— guarda el perfil de la cuenta, cuyo identificador de documento es el `uid` que emite el proveedor de identidad.</w:t>
+        <w:t>Las demás colecciones del modelo documental se detallan a continuación con el mismo formato que la anterior. Cada tabla corresponde a una entidad principal del modelo.</w:t>
+      </w:r>
+    </w:p>
+    <w:p>
+      <w:pPr/>
+      <w:r>
+        <w:t>Diccionario de datos — colección modulos_cultivo</w:t>
+      </w:r>
+    </w:p>
+    <w:tbl>
+      <w:tblPr>
+        <w:tblW w:type="auto" w:w="0"/>
+        <w:tblLook w:firstColumn="1" w:firstRow="1" w:lastColumn="0" w:lastRow="0" w:noHBand="0" w:noVBand="1" w:val="04A0"/>
+      </w:tblPr>
+      <w:tblGrid>
+        <w:gridCol w:w="2073"/>
+        <w:gridCol w:w="2073"/>
+        <w:gridCol w:w="2073"/>
+        <w:gridCol w:w="2073"/>
+        <w:gridCol w:w="2073"/>
+        <w:gridCol w:w="2073"/>
+      </w:tblGrid>
+      <w:tr>
+        <w:tc>
+          <w:tcPr>
+            <w:tcW w:type="dxa" w:w="2073"/>
+          </w:tcPr>
+          <w:p>
+            <w:r/>
+            <w:r>
+              <w:rPr>
+                <w:b/>
+              </w:rPr>
+              <w:t>Campo</w:t>
+            </w:r>
+          </w:p>
+        </w:tc>
+        <w:tc>
+          <w:tcPr>
+            <w:tcW w:type="dxa" w:w="2073"/>
+          </w:tcPr>
+          <w:p>
+            <w:r/>
+            <w:r>
+              <w:rPr>
+                <w:b/>
+              </w:rPr>
+              <w:t>Tipo</w:t>
+            </w:r>
+          </w:p>
+        </w:tc>
+        <w:tc>
+          <w:tcPr>
+            <w:tcW w:type="dxa" w:w="2073"/>
+          </w:tcPr>
+          <w:p>
+            <w:r/>
+            <w:r>
+              <w:rPr>
+                <w:b/>
+              </w:rPr>
+              <w:t>Longitud</w:t>
+            </w:r>
+          </w:p>
+        </w:tc>
+        <w:tc>
+          <w:tcPr>
+            <w:tcW w:type="dxa" w:w="2073"/>
+          </w:tcPr>
+          <w:p>
+            <w:r/>
+            <w:r>
+              <w:rPr>
+                <w:b/>
+              </w:rPr>
+              <w:t>Obligatorio</w:t>
+            </w:r>
+          </w:p>
+        </w:tc>
+        <w:tc>
+          <w:tcPr>
+            <w:tcW w:type="dxa" w:w="2073"/>
+          </w:tcPr>
+          <w:p>
+            <w:r/>
+            <w:r>
+              <w:rPr>
+                <w:b/>
+              </w:rPr>
+              <w:t>Restricción</w:t>
+            </w:r>
+          </w:p>
+        </w:tc>
+        <w:tc>
+          <w:tcPr>
+            <w:tcW w:type="dxa" w:w="2073"/>
+          </w:tcPr>
+          <w:p>
+            <w:r/>
+            <w:r>
+              <w:rPr>
+                <w:b/>
+              </w:rPr>
+              <w:t>Descripción</w:t>
+            </w:r>
+          </w:p>
+        </w:tc>
+      </w:tr>
+      <w:tr>
+        <w:tc>
+          <w:tcPr>
+            <w:tcW w:type="dxa" w:w="2073"/>
+          </w:tcPr>
+          <w:p>
+            <w:r>
+              <w:t>id</w:t>
+            </w:r>
+          </w:p>
+        </w:tc>
+        <w:tc>
+          <w:tcPr>
+            <w:tcW w:type="dxa" w:w="2073"/>
+          </w:tcPr>
+          <w:p>
+            <w:r>
+              <w:t>Texto</w:t>
+            </w:r>
+          </w:p>
+        </w:tc>
+        <w:tc>
+          <w:tcPr>
+            <w:tcW w:type="dxa" w:w="2073"/>
+          </w:tcPr>
+          <w:p>
+            <w:r>
+              <w:t>20</w:t>
+            </w:r>
+          </w:p>
+        </w:tc>
+        <w:tc>
+          <w:tcPr>
+            <w:tcW w:type="dxa" w:w="2073"/>
+          </w:tcPr>
+          <w:p>
+            <w:r>
+              <w:t>Sí</w:t>
+            </w:r>
+          </w:p>
+        </w:tc>
+        <w:tc>
+          <w:tcPr>
+            <w:tcW w:type="dxa" w:w="2073"/>
+          </w:tcPr>
+          <w:p>
+            <w:r>
+              <w:t>Identificador del documento</w:t>
+            </w:r>
+          </w:p>
+        </w:tc>
+        <w:tc>
+          <w:tcPr>
+            <w:tcW w:type="dxa" w:w="2073"/>
+          </w:tcPr>
+          <w:p>
+            <w:r>
+              <w:t>Identificador único del módulo de cultivo</w:t>
+            </w:r>
+          </w:p>
+        </w:tc>
+      </w:tr>
+      <w:tr>
+        <w:tc>
+          <w:tcPr>
+            <w:tcW w:type="dxa" w:w="2073"/>
+          </w:tcPr>
+          <w:p>
+            <w:r>
+              <w:t>nombre</w:t>
+            </w:r>
+          </w:p>
+        </w:tc>
+        <w:tc>
+          <w:tcPr>
+            <w:tcW w:type="dxa" w:w="2073"/>
+          </w:tcPr>
+          <w:p>
+            <w:r>
+              <w:t>Texto</w:t>
+            </w:r>
+          </w:p>
+        </w:tc>
+        <w:tc>
+          <w:tcPr>
+            <w:tcW w:type="dxa" w:w="2073"/>
+          </w:tcPr>
+          <w:p>
+            <w:r>
+              <w:t>60</w:t>
+            </w:r>
+          </w:p>
+        </w:tc>
+        <w:tc>
+          <w:tcPr>
+            <w:tcW w:type="dxa" w:w="2073"/>
+          </w:tcPr>
+          <w:p>
+            <w:r>
+              <w:t>Sí</w:t>
+            </w:r>
+          </w:p>
+        </w:tc>
+        <w:tc>
+          <w:tcPr>
+            <w:tcW w:type="dxa" w:w="2073"/>
+          </w:tcPr>
+          <w:p>
+            <w:r>
+              <w:t>Entre 2 y 60 caracteres</w:t>
+            </w:r>
+          </w:p>
+        </w:tc>
+        <w:tc>
+          <w:tcPr>
+            <w:tcW w:type="dxa" w:w="2073"/>
+          </w:tcPr>
+          <w:p>
+            <w:r>
+              <w:t>Nombre con que se identifica la zona de cultivo</w:t>
+            </w:r>
+          </w:p>
+        </w:tc>
+      </w:tr>
+      <w:tr>
+        <w:tc>
+          <w:tcPr>
+            <w:tcW w:type="dxa" w:w="2073"/>
+          </w:tcPr>
+          <w:p>
+            <w:r>
+              <w:t>tipo_cultivo</w:t>
+            </w:r>
+          </w:p>
+        </w:tc>
+        <w:tc>
+          <w:tcPr>
+            <w:tcW w:type="dxa" w:w="2073"/>
+          </w:tcPr>
+          <w:p>
+            <w:r>
+              <w:t>Texto</w:t>
+            </w:r>
+          </w:p>
+        </w:tc>
+        <w:tc>
+          <w:tcPr>
+            <w:tcW w:type="dxa" w:w="2073"/>
+          </w:tcPr>
+          <w:p>
+            <w:r>
+              <w:t>40</w:t>
+            </w:r>
+          </w:p>
+        </w:tc>
+        <w:tc>
+          <w:tcPr>
+            <w:tcW w:type="dxa" w:w="2073"/>
+          </w:tcPr>
+          <w:p>
+            <w:r>
+              <w:t>Sí</w:t>
+            </w:r>
+          </w:p>
+        </w:tc>
+        <w:tc>
+          <w:tcPr>
+            <w:tcW w:type="dxa" w:w="2073"/>
+          </w:tcPr>
+          <w:p>
+            <w:r>
+              <w:t>Entre 2 y 40 caracteres</w:t>
+            </w:r>
+          </w:p>
+        </w:tc>
+        <w:tc>
+          <w:tcPr>
+            <w:tcW w:type="dxa" w:w="2073"/>
+          </w:tcPr>
+          <w:p>
+            <w:r>
+              <w:t>Especie que se cultiva en el módulo</w:t>
+            </w:r>
+          </w:p>
+        </w:tc>
+      </w:tr>
+      <w:tr>
+        <w:tc>
+          <w:tcPr>
+            <w:tcW w:type="dxa" w:w="2073"/>
+          </w:tcPr>
+          <w:p>
+            <w:r>
+              <w:t>perfil_id</w:t>
+            </w:r>
+          </w:p>
+        </w:tc>
+        <w:tc>
+          <w:tcPr>
+            <w:tcW w:type="dxa" w:w="2073"/>
+          </w:tcPr>
+          <w:p>
+            <w:r>
+              <w:t>Texto</w:t>
+            </w:r>
+          </w:p>
+        </w:tc>
+        <w:tc>
+          <w:tcPr>
+            <w:tcW w:type="dxa" w:w="2073"/>
+          </w:tcPr>
+          <w:p>
+            <w:r>
+              <w:t>64</w:t>
+            </w:r>
+          </w:p>
+        </w:tc>
+        <w:tc>
+          <w:tcPr>
+            <w:tcW w:type="dxa" w:w="2073"/>
+          </w:tcPr>
+          <w:p>
+            <w:r>
+              <w:t>Sí</w:t>
+            </w:r>
+          </w:p>
+        </w:tc>
+        <w:tc>
+          <w:tcPr>
+            <w:tcW w:type="dxa" w:w="2073"/>
+          </w:tcPr>
+          <w:p>
+            <w:r>
+              <w:t>Referencia a perfiles_cultivo</w:t>
+            </w:r>
+          </w:p>
+        </w:tc>
+        <w:tc>
+          <w:tcPr>
+            <w:tcW w:type="dxa" w:w="2073"/>
+          </w:tcPr>
+          <w:p>
+            <w:r>
+              <w:t>Perfil del que el módulo toma sus rangos de referencia</w:t>
+            </w:r>
+          </w:p>
+        </w:tc>
+      </w:tr>
+      <w:tr>
+        <w:tc>
+          <w:tcPr>
+            <w:tcW w:type="dxa" w:w="2073"/>
+          </w:tcPr>
+          <w:p>
+            <w:r>
+              <w:t>ubicacion</w:t>
+            </w:r>
+          </w:p>
+        </w:tc>
+        <w:tc>
+          <w:tcPr>
+            <w:tcW w:type="dxa" w:w="2073"/>
+          </w:tcPr>
+          <w:p>
+            <w:r>
+              <w:t>Texto</w:t>
+            </w:r>
+          </w:p>
+        </w:tc>
+        <w:tc>
+          <w:tcPr>
+            <w:tcW w:type="dxa" w:w="2073"/>
+          </w:tcPr>
+          <w:p>
+            <w:r>
+              <w:t>120</w:t>
+            </w:r>
+          </w:p>
+        </w:tc>
+        <w:tc>
+          <w:tcPr>
+            <w:tcW w:type="dxa" w:w="2073"/>
+          </w:tcPr>
+          <w:p>
+            <w:r>
+              <w:t>No</w:t>
+            </w:r>
+          </w:p>
+        </w:tc>
+        <w:tc>
+          <w:tcPr>
+            <w:tcW w:type="dxa" w:w="2073"/>
+          </w:tcPr>
+          <w:p>
+            <w:r>
+              <w:t>—</w:t>
+            </w:r>
+          </w:p>
+        </w:tc>
+        <w:tc>
+          <w:tcPr>
+            <w:tcW w:type="dxa" w:w="2073"/>
+          </w:tcPr>
+          <w:p>
+            <w:r>
+              <w:t>Ubicación física del módulo</w:t>
+            </w:r>
+          </w:p>
+        </w:tc>
+      </w:tr>
+      <w:tr>
+        <w:tc>
+          <w:tcPr>
+            <w:tcW w:type="dxa" w:w="2073"/>
+          </w:tcPr>
+          <w:p>
+            <w:r>
+              <w:t>activo</w:t>
+            </w:r>
+          </w:p>
+        </w:tc>
+        <w:tc>
+          <w:tcPr>
+            <w:tcW w:type="dxa" w:w="2073"/>
+          </w:tcPr>
+          <w:p>
+            <w:r>
+              <w:t>Booleano</w:t>
+            </w:r>
+          </w:p>
+        </w:tc>
+        <w:tc>
+          <w:tcPr>
+            <w:tcW w:type="dxa" w:w="2073"/>
+          </w:tcPr>
+          <w:p>
+            <w:r>
+              <w:t>—</w:t>
+            </w:r>
+          </w:p>
+        </w:tc>
+        <w:tc>
+          <w:tcPr>
+            <w:tcW w:type="dxa" w:w="2073"/>
+          </w:tcPr>
+          <w:p>
+            <w:r>
+              <w:t>Sí</w:t>
+            </w:r>
+          </w:p>
+        </w:tc>
+        <w:tc>
+          <w:tcPr>
+            <w:tcW w:type="dxa" w:w="2073"/>
+          </w:tcPr>
+          <w:p>
+            <w:r>
+              <w:t>Valor por defecto: verdadero</w:t>
+            </w:r>
+          </w:p>
+        </w:tc>
+        <w:tc>
+          <w:tcPr>
+            <w:tcW w:type="dxa" w:w="2073"/>
+          </w:tcPr>
+          <w:p>
+            <w:r>
+              <w:t>Un módulo inactivo no admite lecturas nuevas</w:t>
+            </w:r>
+          </w:p>
+        </w:tc>
+      </w:tr>
+    </w:tbl>
+    <w:p>
+      <w:pPr/>
+      <w:r>
+        <w:t>Tabla 12. Diccionario de datos de la colección modulos_cultivo. Identifica cada zona de cultivo y el perfil del que toma los rangos con que se evalúan sus lecturas. Fuente: elaboración propia.</w:t>
+      </w:r>
+    </w:p>
+    <w:p>
+      <w:pPr/>
+      <w:r>
+        <w:t>Diccionario de datos — colección perfiles_cultivo</w:t>
+      </w:r>
+    </w:p>
+    <w:tbl>
+      <w:tblPr>
+        <w:tblW w:type="auto" w:w="0"/>
+        <w:tblLook w:firstColumn="1" w:firstRow="1" w:lastColumn="0" w:lastRow="0" w:noHBand="0" w:noVBand="1" w:val="04A0"/>
+      </w:tblPr>
+      <w:tblGrid>
+        <w:gridCol w:w="2073"/>
+        <w:gridCol w:w="2073"/>
+        <w:gridCol w:w="2073"/>
+        <w:gridCol w:w="2073"/>
+        <w:gridCol w:w="2073"/>
+        <w:gridCol w:w="2073"/>
+      </w:tblGrid>
+      <w:tr>
+        <w:tc>
+          <w:tcPr>
+            <w:tcW w:type="dxa" w:w="2073"/>
+          </w:tcPr>
+          <w:p>
+            <w:r/>
+            <w:r>
+              <w:rPr>
+                <w:b/>
+              </w:rPr>
+              <w:t>Campo</w:t>
+            </w:r>
+          </w:p>
+        </w:tc>
+        <w:tc>
+          <w:tcPr>
+            <w:tcW w:type="dxa" w:w="2073"/>
+          </w:tcPr>
+          <w:p>
+            <w:r/>
+            <w:r>
+              <w:rPr>
+                <w:b/>
+              </w:rPr>
+              <w:t>Tipo</w:t>
+            </w:r>
+          </w:p>
+        </w:tc>
+        <w:tc>
+          <w:tcPr>
+            <w:tcW w:type="dxa" w:w="2073"/>
+          </w:tcPr>
+          <w:p>
+            <w:r/>
+            <w:r>
+              <w:rPr>
+                <w:b/>
+              </w:rPr>
+              <w:t>Longitud</w:t>
+            </w:r>
+          </w:p>
+        </w:tc>
+        <w:tc>
+          <w:tcPr>
+            <w:tcW w:type="dxa" w:w="2073"/>
+          </w:tcPr>
+          <w:p>
+            <w:r/>
+            <w:r>
+              <w:rPr>
+                <w:b/>
+              </w:rPr>
+              <w:t>Obligatorio</w:t>
+            </w:r>
+          </w:p>
+        </w:tc>
+        <w:tc>
+          <w:tcPr>
+            <w:tcW w:type="dxa" w:w="2073"/>
+          </w:tcPr>
+          <w:p>
+            <w:r/>
+            <w:r>
+              <w:rPr>
+                <w:b/>
+              </w:rPr>
+              <w:t>Restricción</w:t>
+            </w:r>
+          </w:p>
+        </w:tc>
+        <w:tc>
+          <w:tcPr>
+            <w:tcW w:type="dxa" w:w="2073"/>
+          </w:tcPr>
+          <w:p>
+            <w:r/>
+            <w:r>
+              <w:rPr>
+                <w:b/>
+              </w:rPr>
+              <w:t>Descripción</w:t>
+            </w:r>
+          </w:p>
+        </w:tc>
+      </w:tr>
+      <w:tr>
+        <w:tc>
+          <w:tcPr>
+            <w:tcW w:type="dxa" w:w="2073"/>
+          </w:tcPr>
+          <w:p>
+            <w:r>
+              <w:t>id</w:t>
+            </w:r>
+          </w:p>
+        </w:tc>
+        <w:tc>
+          <w:tcPr>
+            <w:tcW w:type="dxa" w:w="2073"/>
+          </w:tcPr>
+          <w:p>
+            <w:r>
+              <w:t>Texto</w:t>
+            </w:r>
+          </w:p>
+        </w:tc>
+        <w:tc>
+          <w:tcPr>
+            <w:tcW w:type="dxa" w:w="2073"/>
+          </w:tcPr>
+          <w:p>
+            <w:r>
+              <w:t>20</w:t>
+            </w:r>
+          </w:p>
+        </w:tc>
+        <w:tc>
+          <w:tcPr>
+            <w:tcW w:type="dxa" w:w="2073"/>
+          </w:tcPr>
+          <w:p>
+            <w:r>
+              <w:t>Sí</w:t>
+            </w:r>
+          </w:p>
+        </w:tc>
+        <w:tc>
+          <w:tcPr>
+            <w:tcW w:type="dxa" w:w="2073"/>
+          </w:tcPr>
+          <w:p>
+            <w:r>
+              <w:t>Identificador del documento</w:t>
+            </w:r>
+          </w:p>
+        </w:tc>
+        <w:tc>
+          <w:tcPr>
+            <w:tcW w:type="dxa" w:w="2073"/>
+          </w:tcPr>
+          <w:p>
+            <w:r>
+              <w:t>Identificador único del perfil</w:t>
+            </w:r>
+          </w:p>
+        </w:tc>
+      </w:tr>
+      <w:tr>
+        <w:tc>
+          <w:tcPr>
+            <w:tcW w:type="dxa" w:w="2073"/>
+          </w:tcPr>
+          <w:p>
+            <w:r>
+              <w:t>nombre</w:t>
+            </w:r>
+          </w:p>
+        </w:tc>
+        <w:tc>
+          <w:tcPr>
+            <w:tcW w:type="dxa" w:w="2073"/>
+          </w:tcPr>
+          <w:p>
+            <w:r>
+              <w:t>Texto</w:t>
+            </w:r>
+          </w:p>
+        </w:tc>
+        <w:tc>
+          <w:tcPr>
+            <w:tcW w:type="dxa" w:w="2073"/>
+          </w:tcPr>
+          <w:p>
+            <w:r>
+              <w:t>60</w:t>
+            </w:r>
+          </w:p>
+        </w:tc>
+        <w:tc>
+          <w:tcPr>
+            <w:tcW w:type="dxa" w:w="2073"/>
+          </w:tcPr>
+          <w:p>
+            <w:r>
+              <w:t>Sí</w:t>
+            </w:r>
+          </w:p>
+        </w:tc>
+        <w:tc>
+          <w:tcPr>
+            <w:tcW w:type="dxa" w:w="2073"/>
+          </w:tcPr>
+          <w:p>
+            <w:r>
+              <w:t>Entre 2 y 60 caracteres</w:t>
+            </w:r>
+          </w:p>
+        </w:tc>
+        <w:tc>
+          <w:tcPr>
+            <w:tcW w:type="dxa" w:w="2073"/>
+          </w:tcPr>
+          <w:p>
+            <w:r>
+              <w:t>Nombre del cultivo al que corresponde el perfil</w:t>
+            </w:r>
+          </w:p>
+        </w:tc>
+      </w:tr>
+      <w:tr>
+        <w:tc>
+          <w:tcPr>
+            <w:tcW w:type="dxa" w:w="2073"/>
+          </w:tcPr>
+          <w:p>
+            <w:r>
+              <w:t>descripcion</w:t>
+            </w:r>
+          </w:p>
+        </w:tc>
+        <w:tc>
+          <w:tcPr>
+            <w:tcW w:type="dxa" w:w="2073"/>
+          </w:tcPr>
+          <w:p>
+            <w:r>
+              <w:t>Texto</w:t>
+            </w:r>
+          </w:p>
+        </w:tc>
+        <w:tc>
+          <w:tcPr>
+            <w:tcW w:type="dxa" w:w="2073"/>
+          </w:tcPr>
+          <w:p>
+            <w:r>
+              <w:t>200</w:t>
+            </w:r>
+          </w:p>
+        </w:tc>
+        <w:tc>
+          <w:tcPr>
+            <w:tcW w:type="dxa" w:w="2073"/>
+          </w:tcPr>
+          <w:p>
+            <w:r>
+              <w:t>No</w:t>
+            </w:r>
+          </w:p>
+        </w:tc>
+        <w:tc>
+          <w:tcPr>
+            <w:tcW w:type="dxa" w:w="2073"/>
+          </w:tcPr>
+          <w:p>
+            <w:r>
+              <w:t>—</w:t>
+            </w:r>
+          </w:p>
+        </w:tc>
+        <w:tc>
+          <w:tcPr>
+            <w:tcW w:type="dxa" w:w="2073"/>
+          </w:tcPr>
+          <w:p>
+            <w:r>
+              <w:t>Nota sobre el perfil y la procedencia de sus rangos</w:t>
+            </w:r>
+          </w:p>
+        </w:tc>
+      </w:tr>
+      <w:tr>
+        <w:tc>
+          <w:tcPr>
+            <w:tcW w:type="dxa" w:w="2073"/>
+          </w:tcPr>
+          <w:p>
+            <w:r>
+              <w:t>predefinido</w:t>
+            </w:r>
+          </w:p>
+        </w:tc>
+        <w:tc>
+          <w:tcPr>
+            <w:tcW w:type="dxa" w:w="2073"/>
+          </w:tcPr>
+          <w:p>
+            <w:r>
+              <w:t>Booleano</w:t>
+            </w:r>
+          </w:p>
+        </w:tc>
+        <w:tc>
+          <w:tcPr>
+            <w:tcW w:type="dxa" w:w="2073"/>
+          </w:tcPr>
+          <w:p>
+            <w:r>
+              <w:t>—</w:t>
+            </w:r>
+          </w:p>
+        </w:tc>
+        <w:tc>
+          <w:tcPr>
+            <w:tcW w:type="dxa" w:w="2073"/>
+          </w:tcPr>
+          <w:p>
+            <w:r>
+              <w:t>Sí</w:t>
+            </w:r>
+          </w:p>
+        </w:tc>
+        <w:tc>
+          <w:tcPr>
+            <w:tcW w:type="dxa" w:w="2073"/>
+          </w:tcPr>
+          <w:p>
+            <w:r>
+              <w:t>Valor por defecto: falso</w:t>
+            </w:r>
+          </w:p>
+        </w:tc>
+        <w:tc>
+          <w:tcPr>
+            <w:tcW w:type="dxa" w:w="2073"/>
+          </w:tcPr>
+          <w:p>
+            <w:r>
+              <w:t>Distingue los perfiles del catálogo inicial de los creados por el usuario</w:t>
+            </w:r>
+          </w:p>
+        </w:tc>
+      </w:tr>
+    </w:tbl>
+    <w:p>
+      <w:pPr/>
+      <w:r>
+        <w:t>Tabla 13. Diccionario de datos de la colección perfiles_cultivo. Reúne los rangos de referencia de un cultivo; cada módulo adopta uno. Fuente: elaboración propia.</w:t>
+      </w:r>
+    </w:p>
+    <w:p>
+      <w:pPr/>
+      <w:r>
+        <w:t>Diccionario de datos — colección rangos</w:t>
+      </w:r>
+    </w:p>
+    <w:tbl>
+      <w:tblPr>
+        <w:tblW w:type="auto" w:w="0"/>
+        <w:tblLook w:firstColumn="1" w:firstRow="1" w:lastColumn="0" w:lastRow="0" w:noHBand="0" w:noVBand="1" w:val="04A0"/>
+      </w:tblPr>
+      <w:tblGrid>
+        <w:gridCol w:w="2073"/>
+        <w:gridCol w:w="2073"/>
+        <w:gridCol w:w="2073"/>
+        <w:gridCol w:w="2073"/>
+        <w:gridCol w:w="2073"/>
+        <w:gridCol w:w="2073"/>
+      </w:tblGrid>
+      <w:tr>
+        <w:tc>
+          <w:tcPr>
+            <w:tcW w:type="dxa" w:w="2073"/>
+          </w:tcPr>
+          <w:p>
+            <w:r/>
+            <w:r>
+              <w:rPr>
+                <w:b/>
+              </w:rPr>
+              <w:t>Campo</w:t>
+            </w:r>
+          </w:p>
+        </w:tc>
+        <w:tc>
+          <w:tcPr>
+            <w:tcW w:type="dxa" w:w="2073"/>
+          </w:tcPr>
+          <w:p>
+            <w:r/>
+            <w:r>
+              <w:rPr>
+                <w:b/>
+              </w:rPr>
+              <w:t>Tipo</w:t>
+            </w:r>
+          </w:p>
+        </w:tc>
+        <w:tc>
+          <w:tcPr>
+            <w:tcW w:type="dxa" w:w="2073"/>
+          </w:tcPr>
+          <w:p>
+            <w:r/>
+            <w:r>
+              <w:rPr>
+                <w:b/>
+              </w:rPr>
+              <w:t>Longitud</w:t>
+            </w:r>
+          </w:p>
+        </w:tc>
+        <w:tc>
+          <w:tcPr>
+            <w:tcW w:type="dxa" w:w="2073"/>
+          </w:tcPr>
+          <w:p>
+            <w:r/>
+            <w:r>
+              <w:rPr>
+                <w:b/>
+              </w:rPr>
+              <w:t>Obligatorio</w:t>
+            </w:r>
+          </w:p>
+        </w:tc>
+        <w:tc>
+          <w:tcPr>
+            <w:tcW w:type="dxa" w:w="2073"/>
+          </w:tcPr>
+          <w:p>
+            <w:r/>
+            <w:r>
+              <w:rPr>
+                <w:b/>
+              </w:rPr>
+              <w:t>Restricción</w:t>
+            </w:r>
+          </w:p>
+        </w:tc>
+        <w:tc>
+          <w:tcPr>
+            <w:tcW w:type="dxa" w:w="2073"/>
+          </w:tcPr>
+          <w:p>
+            <w:r/>
+            <w:r>
+              <w:rPr>
+                <w:b/>
+              </w:rPr>
+              <w:t>Descripción</w:t>
+            </w:r>
+          </w:p>
+        </w:tc>
+      </w:tr>
+      <w:tr>
+        <w:tc>
+          <w:tcPr>
+            <w:tcW w:type="dxa" w:w="2073"/>
+          </w:tcPr>
+          <w:p>
+            <w:r>
+              <w:t>id</w:t>
+            </w:r>
+          </w:p>
+        </w:tc>
+        <w:tc>
+          <w:tcPr>
+            <w:tcW w:type="dxa" w:w="2073"/>
+          </w:tcPr>
+          <w:p>
+            <w:r>
+              <w:t>Texto</w:t>
+            </w:r>
+          </w:p>
+        </w:tc>
+        <w:tc>
+          <w:tcPr>
+            <w:tcW w:type="dxa" w:w="2073"/>
+          </w:tcPr>
+          <w:p>
+            <w:r>
+              <w:t>20</w:t>
+            </w:r>
+          </w:p>
+        </w:tc>
+        <w:tc>
+          <w:tcPr>
+            <w:tcW w:type="dxa" w:w="2073"/>
+          </w:tcPr>
+          <w:p>
+            <w:r>
+              <w:t>Sí</w:t>
+            </w:r>
+          </w:p>
+        </w:tc>
+        <w:tc>
+          <w:tcPr>
+            <w:tcW w:type="dxa" w:w="2073"/>
+          </w:tcPr>
+          <w:p>
+            <w:r>
+              <w:t>Identificador del documento</w:t>
+            </w:r>
+          </w:p>
+        </w:tc>
+        <w:tc>
+          <w:tcPr>
+            <w:tcW w:type="dxa" w:w="2073"/>
+          </w:tcPr>
+          <w:p>
+            <w:r>
+              <w:t>Identificador único del rango</w:t>
+            </w:r>
+          </w:p>
+        </w:tc>
+      </w:tr>
+      <w:tr>
+        <w:tc>
+          <w:tcPr>
+            <w:tcW w:type="dxa" w:w="2073"/>
+          </w:tcPr>
+          <w:p>
+            <w:r>
+              <w:t>perfil_id</w:t>
+            </w:r>
+          </w:p>
+        </w:tc>
+        <w:tc>
+          <w:tcPr>
+            <w:tcW w:type="dxa" w:w="2073"/>
+          </w:tcPr>
+          <w:p>
+            <w:r>
+              <w:t>Texto</w:t>
+            </w:r>
+          </w:p>
+        </w:tc>
+        <w:tc>
+          <w:tcPr>
+            <w:tcW w:type="dxa" w:w="2073"/>
+          </w:tcPr>
+          <w:p>
+            <w:r>
+              <w:t>64</w:t>
+            </w:r>
+          </w:p>
+        </w:tc>
+        <w:tc>
+          <w:tcPr>
+            <w:tcW w:type="dxa" w:w="2073"/>
+          </w:tcPr>
+          <w:p>
+            <w:r>
+              <w:t>Sí</w:t>
+            </w:r>
+          </w:p>
+        </w:tc>
+        <w:tc>
+          <w:tcPr>
+            <w:tcW w:type="dxa" w:w="2073"/>
+          </w:tcPr>
+          <w:p>
+            <w:r>
+              <w:t>Referencia a perfiles_cultivo</w:t>
+            </w:r>
+          </w:p>
+        </w:tc>
+        <w:tc>
+          <w:tcPr>
+            <w:tcW w:type="dxa" w:w="2073"/>
+          </w:tcPr>
+          <w:p>
+            <w:r>
+              <w:t>Perfil al que pertenece el rango</w:t>
+            </w:r>
+          </w:p>
+        </w:tc>
+      </w:tr>
+      <w:tr>
+        <w:tc>
+          <w:tcPr>
+            <w:tcW w:type="dxa" w:w="2073"/>
+          </w:tcPr>
+          <w:p>
+            <w:r>
+              <w:t>variable</w:t>
+            </w:r>
+          </w:p>
+        </w:tc>
+        <w:tc>
+          <w:tcPr>
+            <w:tcW w:type="dxa" w:w="2073"/>
+          </w:tcPr>
+          <w:p>
+            <w:r>
+              <w:t>Texto</w:t>
+            </w:r>
+          </w:p>
+        </w:tc>
+        <w:tc>
+          <w:tcPr>
+            <w:tcW w:type="dxa" w:w="2073"/>
+          </w:tcPr>
+          <w:p>
+            <w:r>
+              <w:t>32</w:t>
+            </w:r>
+          </w:p>
+        </w:tc>
+        <w:tc>
+          <w:tcPr>
+            <w:tcW w:type="dxa" w:w="2073"/>
+          </w:tcPr>
+          <w:p>
+            <w:r>
+              <w:t>Sí</w:t>
+            </w:r>
+          </w:p>
+        </w:tc>
+        <w:tc>
+          <w:tcPr>
+            <w:tcW w:type="dxa" w:w="2073"/>
+          </w:tcPr>
+          <w:p>
+            <w:r>
+              <w:t>Catálogo de siete variables</w:t>
+            </w:r>
+          </w:p>
+        </w:tc>
+        <w:tc>
+          <w:tcPr>
+            <w:tcW w:type="dxa" w:w="2073"/>
+          </w:tcPr>
+          <w:p>
+            <w:r>
+              <w:t>Variable a la que se aplica el límite</w:t>
+            </w:r>
+          </w:p>
+        </w:tc>
+      </w:tr>
+      <w:tr>
+        <w:tc>
+          <w:tcPr>
+            <w:tcW w:type="dxa" w:w="2073"/>
+          </w:tcPr>
+          <w:p>
+            <w:r>
+              <w:t>minimo</w:t>
+            </w:r>
+          </w:p>
+        </w:tc>
+        <w:tc>
+          <w:tcPr>
+            <w:tcW w:type="dxa" w:w="2073"/>
+          </w:tcPr>
+          <w:p>
+            <w:r>
+              <w:t>Numérico</w:t>
+            </w:r>
+          </w:p>
+        </w:tc>
+        <w:tc>
+          <w:tcPr>
+            <w:tcW w:type="dxa" w:w="2073"/>
+          </w:tcPr>
+          <w:p>
+            <w:r>
+              <w:t>—</w:t>
+            </w:r>
+          </w:p>
+        </w:tc>
+        <w:tc>
+          <w:tcPr>
+            <w:tcW w:type="dxa" w:w="2073"/>
+          </w:tcPr>
+          <w:p>
+            <w:r>
+              <w:t>Sí</w:t>
+            </w:r>
+          </w:p>
+        </w:tc>
+        <w:tc>
+          <w:tcPr>
+            <w:tcW w:type="dxa" w:w="2073"/>
+          </w:tcPr>
+          <w:p>
+            <w:r>
+              <w:t>Menor que el máximo</w:t>
+            </w:r>
+          </w:p>
+        </w:tc>
+        <w:tc>
+          <w:tcPr>
+            <w:tcW w:type="dxa" w:w="2073"/>
+          </w:tcPr>
+          <w:p>
+            <w:r>
+              <w:t>Límite inferior del rango de referencia</w:t>
+            </w:r>
+          </w:p>
+        </w:tc>
+      </w:tr>
+      <w:tr>
+        <w:tc>
+          <w:tcPr>
+            <w:tcW w:type="dxa" w:w="2073"/>
+          </w:tcPr>
+          <w:p>
+            <w:r>
+              <w:t>maximo</w:t>
+            </w:r>
+          </w:p>
+        </w:tc>
+        <w:tc>
+          <w:tcPr>
+            <w:tcW w:type="dxa" w:w="2073"/>
+          </w:tcPr>
+          <w:p>
+            <w:r>
+              <w:t>Numérico</w:t>
+            </w:r>
+          </w:p>
+        </w:tc>
+        <w:tc>
+          <w:tcPr>
+            <w:tcW w:type="dxa" w:w="2073"/>
+          </w:tcPr>
+          <w:p>
+            <w:r>
+              <w:t>—</w:t>
+            </w:r>
+          </w:p>
+        </w:tc>
+        <w:tc>
+          <w:tcPr>
+            <w:tcW w:type="dxa" w:w="2073"/>
+          </w:tcPr>
+          <w:p>
+            <w:r>
+              <w:t>Sí</w:t>
+            </w:r>
+          </w:p>
+        </w:tc>
+        <w:tc>
+          <w:tcPr>
+            <w:tcW w:type="dxa" w:w="2073"/>
+          </w:tcPr>
+          <w:p>
+            <w:r>
+              <w:t>Mayor que el mínimo</w:t>
+            </w:r>
+          </w:p>
+        </w:tc>
+        <w:tc>
+          <w:tcPr>
+            <w:tcW w:type="dxa" w:w="2073"/>
+          </w:tcPr>
+          <w:p>
+            <w:r>
+              <w:t>Límite superior del rango de referencia</w:t>
+            </w:r>
+          </w:p>
+        </w:tc>
+      </w:tr>
+      <w:tr>
+        <w:tc>
+          <w:tcPr>
+            <w:tcW w:type="dxa" w:w="2073"/>
+          </w:tcPr>
+          <w:p>
+            <w:r>
+              <w:t>unidad</w:t>
+            </w:r>
+          </w:p>
+        </w:tc>
+        <w:tc>
+          <w:tcPr>
+            <w:tcW w:type="dxa" w:w="2073"/>
+          </w:tcPr>
+          <w:p>
+            <w:r>
+              <w:t>Texto</w:t>
+            </w:r>
+          </w:p>
+        </w:tc>
+        <w:tc>
+          <w:tcPr>
+            <w:tcW w:type="dxa" w:w="2073"/>
+          </w:tcPr>
+          <w:p>
+            <w:r>
+              <w:t>16</w:t>
+            </w:r>
+          </w:p>
+        </w:tc>
+        <w:tc>
+          <w:tcPr>
+            <w:tcW w:type="dxa" w:w="2073"/>
+          </w:tcPr>
+          <w:p>
+            <w:r>
+              <w:t>Sí</w:t>
+            </w:r>
+          </w:p>
+        </w:tc>
+        <w:tc>
+          <w:tcPr>
+            <w:tcW w:type="dxa" w:w="2073"/>
+          </w:tcPr>
+          <w:p>
+            <w:r>
+              <w:t>Heredada del catálogo</w:t>
+            </w:r>
+          </w:p>
+        </w:tc>
+        <w:tc>
+          <w:tcPr>
+            <w:tcW w:type="dxa" w:w="2073"/>
+          </w:tcPr>
+          <w:p>
+            <w:r>
+              <w:t>Unidad de la variable, tomada del catálogo del sistema</w:t>
+            </w:r>
+          </w:p>
+        </w:tc>
+      </w:tr>
+    </w:tbl>
+    <w:p>
+      <w:pPr/>
+      <w:r>
+        <w:t>Tabla 14. Diccionario de datos de la colección rangos. Fija los límites de cada variable por perfil, con el mínimo menor que el máximo. Fuente: elaboración propia.</w:t>
+      </w:r>
+    </w:p>
+    <w:p>
+      <w:pPr/>
+      <w:r>
+        <w:t>Diccionario de datos — colección alertas</w:t>
+      </w:r>
+    </w:p>
+    <w:tbl>
+      <w:tblPr>
+        <w:tblW w:type="auto" w:w="0"/>
+        <w:tblLook w:firstColumn="1" w:firstRow="1" w:lastColumn="0" w:lastRow="0" w:noHBand="0" w:noVBand="1" w:val="04A0"/>
+      </w:tblPr>
+      <w:tblGrid>
+        <w:gridCol w:w="2073"/>
+        <w:gridCol w:w="2073"/>
+        <w:gridCol w:w="2073"/>
+        <w:gridCol w:w="2073"/>
+        <w:gridCol w:w="2073"/>
+        <w:gridCol w:w="2073"/>
+      </w:tblGrid>
+      <w:tr>
+        <w:tc>
+          <w:tcPr>
+            <w:tcW w:type="dxa" w:w="2073"/>
+          </w:tcPr>
+          <w:p>
+            <w:r/>
+            <w:r>
+              <w:rPr>
+                <w:b/>
+              </w:rPr>
+              <w:t>Campo</w:t>
+            </w:r>
+          </w:p>
+        </w:tc>
+        <w:tc>
+          <w:tcPr>
+            <w:tcW w:type="dxa" w:w="2073"/>
+          </w:tcPr>
+          <w:p>
+            <w:r/>
+            <w:r>
+              <w:rPr>
+                <w:b/>
+              </w:rPr>
+              <w:t>Tipo</w:t>
+            </w:r>
+          </w:p>
+        </w:tc>
+        <w:tc>
+          <w:tcPr>
+            <w:tcW w:type="dxa" w:w="2073"/>
+          </w:tcPr>
+          <w:p>
+            <w:r/>
+            <w:r>
+              <w:rPr>
+                <w:b/>
+              </w:rPr>
+              <w:t>Longitud</w:t>
+            </w:r>
+          </w:p>
+        </w:tc>
+        <w:tc>
+          <w:tcPr>
+            <w:tcW w:type="dxa" w:w="2073"/>
+          </w:tcPr>
+          <w:p>
+            <w:r/>
+            <w:r>
+              <w:rPr>
+                <w:b/>
+              </w:rPr>
+              <w:t>Obligatorio</w:t>
+            </w:r>
+          </w:p>
+        </w:tc>
+        <w:tc>
+          <w:tcPr>
+            <w:tcW w:type="dxa" w:w="2073"/>
+          </w:tcPr>
+          <w:p>
+            <w:r/>
+            <w:r>
+              <w:rPr>
+                <w:b/>
+              </w:rPr>
+              <w:t>Restricción</w:t>
+            </w:r>
+          </w:p>
+        </w:tc>
+        <w:tc>
+          <w:tcPr>
+            <w:tcW w:type="dxa" w:w="2073"/>
+          </w:tcPr>
+          <w:p>
+            <w:r/>
+            <w:r>
+              <w:rPr>
+                <w:b/>
+              </w:rPr>
+              <w:t>Descripción</w:t>
+            </w:r>
+          </w:p>
+        </w:tc>
+      </w:tr>
+      <w:tr>
+        <w:tc>
+          <w:tcPr>
+            <w:tcW w:type="dxa" w:w="2073"/>
+          </w:tcPr>
+          <w:p>
+            <w:r>
+              <w:t>id</w:t>
+            </w:r>
+          </w:p>
+        </w:tc>
+        <w:tc>
+          <w:tcPr>
+            <w:tcW w:type="dxa" w:w="2073"/>
+          </w:tcPr>
+          <w:p>
+            <w:r>
+              <w:t>Texto</w:t>
+            </w:r>
+          </w:p>
+        </w:tc>
+        <w:tc>
+          <w:tcPr>
+            <w:tcW w:type="dxa" w:w="2073"/>
+          </w:tcPr>
+          <w:p>
+            <w:r>
+              <w:t>20</w:t>
+            </w:r>
+          </w:p>
+        </w:tc>
+        <w:tc>
+          <w:tcPr>
+            <w:tcW w:type="dxa" w:w="2073"/>
+          </w:tcPr>
+          <w:p>
+            <w:r>
+              <w:t>Sí</w:t>
+            </w:r>
+          </w:p>
+        </w:tc>
+        <w:tc>
+          <w:tcPr>
+            <w:tcW w:type="dxa" w:w="2073"/>
+          </w:tcPr>
+          <w:p>
+            <w:r>
+              <w:t>Identificador del documento</w:t>
+            </w:r>
+          </w:p>
+        </w:tc>
+        <w:tc>
+          <w:tcPr>
+            <w:tcW w:type="dxa" w:w="2073"/>
+          </w:tcPr>
+          <w:p>
+            <w:r>
+              <w:t>Identificador único de la alerta</w:t>
+            </w:r>
+          </w:p>
+        </w:tc>
+      </w:tr>
+      <w:tr>
+        <w:tc>
+          <w:tcPr>
+            <w:tcW w:type="dxa" w:w="2073"/>
+          </w:tcPr>
+          <w:p>
+            <w:r>
+              <w:t>lectura_id</w:t>
+            </w:r>
+          </w:p>
+        </w:tc>
+        <w:tc>
+          <w:tcPr>
+            <w:tcW w:type="dxa" w:w="2073"/>
+          </w:tcPr>
+          <w:p>
+            <w:r>
+              <w:t>Texto</w:t>
+            </w:r>
+          </w:p>
+        </w:tc>
+        <w:tc>
+          <w:tcPr>
+            <w:tcW w:type="dxa" w:w="2073"/>
+          </w:tcPr>
+          <w:p>
+            <w:r>
+              <w:t>20</w:t>
+            </w:r>
+          </w:p>
+        </w:tc>
+        <w:tc>
+          <w:tcPr>
+            <w:tcW w:type="dxa" w:w="2073"/>
+          </w:tcPr>
+          <w:p>
+            <w:r>
+              <w:t>Sí</w:t>
+            </w:r>
+          </w:p>
+        </w:tc>
+        <w:tc>
+          <w:tcPr>
+            <w:tcW w:type="dxa" w:w="2073"/>
+          </w:tcPr>
+          <w:p>
+            <w:r>
+              <w:t>Referencia a lecturas</w:t>
+            </w:r>
+          </w:p>
+        </w:tc>
+        <w:tc>
+          <w:tcPr>
+            <w:tcW w:type="dxa" w:w="2073"/>
+          </w:tcPr>
+          <w:p>
+            <w:r>
+              <w:t>Lectura que originó la alerta</w:t>
+            </w:r>
+          </w:p>
+        </w:tc>
+      </w:tr>
+      <w:tr>
+        <w:tc>
+          <w:tcPr>
+            <w:tcW w:type="dxa" w:w="2073"/>
+          </w:tcPr>
+          <w:p>
+            <w:r>
+              <w:t>modulo_id</w:t>
+            </w:r>
+          </w:p>
+        </w:tc>
+        <w:tc>
+          <w:tcPr>
+            <w:tcW w:type="dxa" w:w="2073"/>
+          </w:tcPr>
+          <w:p>
+            <w:r>
+              <w:t>Texto</w:t>
+            </w:r>
+          </w:p>
+        </w:tc>
+        <w:tc>
+          <w:tcPr>
+            <w:tcW w:type="dxa" w:w="2073"/>
+          </w:tcPr>
+          <w:p>
+            <w:r>
+              <w:t>64</w:t>
+            </w:r>
+          </w:p>
+        </w:tc>
+        <w:tc>
+          <w:tcPr>
+            <w:tcW w:type="dxa" w:w="2073"/>
+          </w:tcPr>
+          <w:p>
+            <w:r>
+              <w:t>Sí</w:t>
+            </w:r>
+          </w:p>
+        </w:tc>
+        <w:tc>
+          <w:tcPr>
+            <w:tcW w:type="dxa" w:w="2073"/>
+          </w:tcPr>
+          <w:p>
+            <w:r>
+              <w:t>Referencia a modulos_cultivo</w:t>
+            </w:r>
+          </w:p>
+        </w:tc>
+        <w:tc>
+          <w:tcPr>
+            <w:tcW w:type="dxa" w:w="2073"/>
+          </w:tcPr>
+          <w:p>
+            <w:r>
+              <w:t>Módulo en el que se produjo la desviación</w:t>
+            </w:r>
+          </w:p>
+        </w:tc>
+      </w:tr>
+      <w:tr>
+        <w:tc>
+          <w:tcPr>
+            <w:tcW w:type="dxa" w:w="2073"/>
+          </w:tcPr>
+          <w:p>
+            <w:r>
+              <w:t>variable</w:t>
+            </w:r>
+          </w:p>
+        </w:tc>
+        <w:tc>
+          <w:tcPr>
+            <w:tcW w:type="dxa" w:w="2073"/>
+          </w:tcPr>
+          <w:p>
+            <w:r>
+              <w:t>Texto</w:t>
+            </w:r>
+          </w:p>
+        </w:tc>
+        <w:tc>
+          <w:tcPr>
+            <w:tcW w:type="dxa" w:w="2073"/>
+          </w:tcPr>
+          <w:p>
+            <w:r>
+              <w:t>32</w:t>
+            </w:r>
+          </w:p>
+        </w:tc>
+        <w:tc>
+          <w:tcPr>
+            <w:tcW w:type="dxa" w:w="2073"/>
+          </w:tcPr>
+          <w:p>
+            <w:r>
+              <w:t>Sí</w:t>
+            </w:r>
+          </w:p>
+        </w:tc>
+        <w:tc>
+          <w:tcPr>
+            <w:tcW w:type="dxa" w:w="2073"/>
+          </w:tcPr>
+          <w:p>
+            <w:r>
+              <w:t>Catálogo de siete variables</w:t>
+            </w:r>
+          </w:p>
+        </w:tc>
+        <w:tc>
+          <w:tcPr>
+            <w:tcW w:type="dxa" w:w="2073"/>
+          </w:tcPr>
+          <w:p>
+            <w:r>
+              <w:t>Variable que salió del rango de referencia</w:t>
+            </w:r>
+          </w:p>
+        </w:tc>
+      </w:tr>
+      <w:tr>
+        <w:tc>
+          <w:tcPr>
+            <w:tcW w:type="dxa" w:w="2073"/>
+          </w:tcPr>
+          <w:p>
+            <w:r>
+              <w:t>valor</w:t>
+            </w:r>
+          </w:p>
+        </w:tc>
+        <w:tc>
+          <w:tcPr>
+            <w:tcW w:type="dxa" w:w="2073"/>
+          </w:tcPr>
+          <w:p>
+            <w:r>
+              <w:t>Numérico</w:t>
+            </w:r>
+          </w:p>
+        </w:tc>
+        <w:tc>
+          <w:tcPr>
+            <w:tcW w:type="dxa" w:w="2073"/>
+          </w:tcPr>
+          <w:p>
+            <w:r>
+              <w:t>—</w:t>
+            </w:r>
+          </w:p>
+        </w:tc>
+        <w:tc>
+          <w:tcPr>
+            <w:tcW w:type="dxa" w:w="2073"/>
+          </w:tcPr>
+          <w:p>
+            <w:r>
+              <w:t>Sí</w:t>
+            </w:r>
+          </w:p>
+        </w:tc>
+        <w:tc>
+          <w:tcPr>
+            <w:tcW w:type="dxa" w:w="2073"/>
+          </w:tcPr>
+          <w:p>
+            <w:r>
+              <w:t>Dentro del límite físico de la variable</w:t>
+            </w:r>
+          </w:p>
+        </w:tc>
+        <w:tc>
+          <w:tcPr>
+            <w:tcW w:type="dxa" w:w="2073"/>
+          </w:tcPr>
+          <w:p>
+            <w:r>
+              <w:t>Valor medido que provocó la alerta</w:t>
+            </w:r>
+          </w:p>
+        </w:tc>
+      </w:tr>
+      <w:tr>
+        <w:tc>
+          <w:tcPr>
+            <w:tcW w:type="dxa" w:w="2073"/>
+          </w:tcPr>
+          <w:p>
+            <w:r>
+              <w:t>unidad</w:t>
+            </w:r>
+          </w:p>
+        </w:tc>
+        <w:tc>
+          <w:tcPr>
+            <w:tcW w:type="dxa" w:w="2073"/>
+          </w:tcPr>
+          <w:p>
+            <w:r>
+              <w:t>Texto</w:t>
+            </w:r>
+          </w:p>
+        </w:tc>
+        <w:tc>
+          <w:tcPr>
+            <w:tcW w:type="dxa" w:w="2073"/>
+          </w:tcPr>
+          <w:p>
+            <w:r>
+              <w:t>16</w:t>
+            </w:r>
+          </w:p>
+        </w:tc>
+        <w:tc>
+          <w:tcPr>
+            <w:tcW w:type="dxa" w:w="2073"/>
+          </w:tcPr>
+          <w:p>
+            <w:r>
+              <w:t>Sí</w:t>
+            </w:r>
+          </w:p>
+        </w:tc>
+        <w:tc>
+          <w:tcPr>
+            <w:tcW w:type="dxa" w:w="2073"/>
+          </w:tcPr>
+          <w:p>
+            <w:r>
+              <w:t>Heredada del catálogo</w:t>
+            </w:r>
+          </w:p>
+        </w:tc>
+        <w:tc>
+          <w:tcPr>
+            <w:tcW w:type="dxa" w:w="2073"/>
+          </w:tcPr>
+          <w:p>
+            <w:r>
+              <w:t>Unidad correspondiente a la variable</w:t>
+            </w:r>
+          </w:p>
+        </w:tc>
+      </w:tr>
+      <w:tr>
+        <w:tc>
+          <w:tcPr>
+            <w:tcW w:type="dxa" w:w="2073"/>
+          </w:tcPr>
+          <w:p>
+            <w:r>
+              <w:t>rango_minimo</w:t>
+            </w:r>
+          </w:p>
+        </w:tc>
+        <w:tc>
+          <w:tcPr>
+            <w:tcW w:type="dxa" w:w="2073"/>
+          </w:tcPr>
+          <w:p>
+            <w:r>
+              <w:t>Numérico</w:t>
+            </w:r>
+          </w:p>
+        </w:tc>
+        <w:tc>
+          <w:tcPr>
+            <w:tcW w:type="dxa" w:w="2073"/>
+          </w:tcPr>
+          <w:p>
+            <w:r>
+              <w:t>—</w:t>
+            </w:r>
+          </w:p>
+        </w:tc>
+        <w:tc>
+          <w:tcPr>
+            <w:tcW w:type="dxa" w:w="2073"/>
+          </w:tcPr>
+          <w:p>
+            <w:r>
+              <w:t>Sí</w:t>
+            </w:r>
+          </w:p>
+        </w:tc>
+        <w:tc>
+          <w:tcPr>
+            <w:tcW w:type="dxa" w:w="2073"/>
+          </w:tcPr>
+          <w:p>
+            <w:r>
+              <w:t>Límite vigente al medir</w:t>
+            </w:r>
+          </w:p>
+        </w:tc>
+        <w:tc>
+          <w:tcPr>
+            <w:tcW w:type="dxa" w:w="2073"/>
+          </w:tcPr>
+          <w:p>
+            <w:r>
+              <w:t>Límite inferior aplicado en la evaluación de esa lectura</w:t>
+            </w:r>
+          </w:p>
+        </w:tc>
+      </w:tr>
+      <w:tr>
+        <w:tc>
+          <w:tcPr>
+            <w:tcW w:type="dxa" w:w="2073"/>
+          </w:tcPr>
+          <w:p>
+            <w:r>
+              <w:t>rango_maximo</w:t>
+            </w:r>
+          </w:p>
+        </w:tc>
+        <w:tc>
+          <w:tcPr>
+            <w:tcW w:type="dxa" w:w="2073"/>
+          </w:tcPr>
+          <w:p>
+            <w:r>
+              <w:t>Numérico</w:t>
+            </w:r>
+          </w:p>
+        </w:tc>
+        <w:tc>
+          <w:tcPr>
+            <w:tcW w:type="dxa" w:w="2073"/>
+          </w:tcPr>
+          <w:p>
+            <w:r>
+              <w:t>—</w:t>
+            </w:r>
+          </w:p>
+        </w:tc>
+        <w:tc>
+          <w:tcPr>
+            <w:tcW w:type="dxa" w:w="2073"/>
+          </w:tcPr>
+          <w:p>
+            <w:r>
+              <w:t>Sí</w:t>
+            </w:r>
+          </w:p>
+        </w:tc>
+        <w:tc>
+          <w:tcPr>
+            <w:tcW w:type="dxa" w:w="2073"/>
+          </w:tcPr>
+          <w:p>
+            <w:r>
+              <w:t>Límite vigente al medir</w:t>
+            </w:r>
+          </w:p>
+        </w:tc>
+        <w:tc>
+          <w:tcPr>
+            <w:tcW w:type="dxa" w:w="2073"/>
+          </w:tcPr>
+          <w:p>
+            <w:r>
+              <w:t>Límite superior aplicado en la evaluación de esa lectura</w:t>
+            </w:r>
+          </w:p>
+        </w:tc>
+      </w:tr>
+      <w:tr>
+        <w:tc>
+          <w:tcPr>
+            <w:tcW w:type="dxa" w:w="2073"/>
+          </w:tcPr>
+          <w:p>
+            <w:r>
+              <w:t>desviacion</w:t>
+            </w:r>
+          </w:p>
+        </w:tc>
+        <w:tc>
+          <w:tcPr>
+            <w:tcW w:type="dxa" w:w="2073"/>
+          </w:tcPr>
+          <w:p>
+            <w:r>
+              <w:t>Texto</w:t>
+            </w:r>
+          </w:p>
+        </w:tc>
+        <w:tc>
+          <w:tcPr>
+            <w:tcW w:type="dxa" w:w="2073"/>
+          </w:tcPr>
+          <w:p>
+            <w:r>
+              <w:t>60</w:t>
+            </w:r>
+          </w:p>
+        </w:tc>
+        <w:tc>
+          <w:tcPr>
+            <w:tcW w:type="dxa" w:w="2073"/>
+          </w:tcPr>
+          <w:p>
+            <w:r>
+              <w:t>No</w:t>
+            </w:r>
+          </w:p>
+        </w:tc>
+        <w:tc>
+          <w:tcPr>
+            <w:tcW w:type="dxa" w:w="2073"/>
+          </w:tcPr>
+          <w:p>
+            <w:r>
+              <w:t>—</w:t>
+            </w:r>
+          </w:p>
+        </w:tc>
+        <w:tc>
+          <w:tcPr>
+            <w:tcW w:type="dxa" w:w="2073"/>
+          </w:tcPr>
+          <w:p>
+            <w:r>
+              <w:t>Diferencia respecto del límite, ya formateada para presentación</w:t>
+            </w:r>
+          </w:p>
+        </w:tc>
+      </w:tr>
+      <w:tr>
+        <w:tc>
+          <w:tcPr>
+            <w:tcW w:type="dxa" w:w="2073"/>
+          </w:tcPr>
+          <w:p>
+            <w:r>
+              <w:t>estado</w:t>
+            </w:r>
+          </w:p>
+        </w:tc>
+        <w:tc>
+          <w:tcPr>
+            <w:tcW w:type="dxa" w:w="2073"/>
+          </w:tcPr>
+          <w:p>
+            <w:r>
+              <w:t>Texto</w:t>
+            </w:r>
+          </w:p>
+        </w:tc>
+        <w:tc>
+          <w:tcPr>
+            <w:tcW w:type="dxa" w:w="2073"/>
+          </w:tcPr>
+          <w:p>
+            <w:r>
+              <w:t>10</w:t>
+            </w:r>
+          </w:p>
+        </w:tc>
+        <w:tc>
+          <w:tcPr>
+            <w:tcW w:type="dxa" w:w="2073"/>
+          </w:tcPr>
+          <w:p>
+            <w:r>
+              <w:t>Sí</w:t>
+            </w:r>
+          </w:p>
+        </w:tc>
+        <w:tc>
+          <w:tcPr>
+            <w:tcW w:type="dxa" w:w="2073"/>
+          </w:tcPr>
+          <w:p>
+            <w:r>
+              <w:t>activa o atendida (dominio cerrado)</w:t>
+            </w:r>
+          </w:p>
+        </w:tc>
+        <w:tc>
+          <w:tcPr>
+            <w:tcW w:type="dxa" w:w="2073"/>
+          </w:tcPr>
+          <w:p>
+            <w:r>
+              <w:t>Situación de la alerta dentro del flujo de atención</w:t>
+            </w:r>
+          </w:p>
+        </w:tc>
+      </w:tr>
+      <w:tr>
+        <w:tc>
+          <w:tcPr>
+            <w:tcW w:type="dxa" w:w="2073"/>
+          </w:tcPr>
+          <w:p>
+            <w:r>
+              <w:t>timestamp</w:t>
+            </w:r>
+          </w:p>
+        </w:tc>
+        <w:tc>
+          <w:tcPr>
+            <w:tcW w:type="dxa" w:w="2073"/>
+          </w:tcPr>
+          <w:p>
+            <w:r>
+              <w:t>Fecha y hora</w:t>
+            </w:r>
+          </w:p>
+        </w:tc>
+        <w:tc>
+          <w:tcPr>
+            <w:tcW w:type="dxa" w:w="2073"/>
+          </w:tcPr>
+          <w:p>
+            <w:r>
+              <w:t>—</w:t>
+            </w:r>
+          </w:p>
+        </w:tc>
+        <w:tc>
+          <w:tcPr>
+            <w:tcW w:type="dxa" w:w="2073"/>
+          </w:tcPr>
+          <w:p>
+            <w:r>
+              <w:t>Sí</w:t>
+            </w:r>
+          </w:p>
+        </w:tc>
+        <w:tc>
+          <w:tcPr>
+            <w:tcW w:type="dxa" w:w="2073"/>
+          </w:tcPr>
+          <w:p>
+            <w:r>
+              <w:t>ISO 8601 en UTC</w:t>
+            </w:r>
+          </w:p>
+        </w:tc>
+        <w:tc>
+          <w:tcPr>
+            <w:tcW w:type="dxa" w:w="2073"/>
+          </w:tcPr>
+          <w:p>
+            <w:r>
+              <w:t>Momento de la lectura que originó la alerta</w:t>
+            </w:r>
+          </w:p>
+        </w:tc>
+      </w:tr>
+      <w:tr>
+        <w:tc>
+          <w:tcPr>
+            <w:tcW w:type="dxa" w:w="2073"/>
+          </w:tcPr>
+          <w:p>
+            <w:r>
+              <w:t>observacion</w:t>
+            </w:r>
+          </w:p>
+        </w:tc>
+        <w:tc>
+          <w:tcPr>
+            <w:tcW w:type="dxa" w:w="2073"/>
+          </w:tcPr>
+          <w:p>
+            <w:r>
+              <w:t>Texto</w:t>
+            </w:r>
+          </w:p>
+        </w:tc>
+        <w:tc>
+          <w:tcPr>
+            <w:tcW w:type="dxa" w:w="2073"/>
+          </w:tcPr>
+          <w:p>
+            <w:r>
+              <w:t>200</w:t>
+            </w:r>
+          </w:p>
+        </w:tc>
+        <w:tc>
+          <w:tcPr>
+            <w:tcW w:type="dxa" w:w="2073"/>
+          </w:tcPr>
+          <w:p>
+            <w:r>
+              <w:t>No</w:t>
+            </w:r>
+          </w:p>
+        </w:tc>
+        <w:tc>
+          <w:tcPr>
+            <w:tcW w:type="dxa" w:w="2073"/>
+          </w:tcPr>
+          <w:p>
+            <w:r>
+              <w:t>—</w:t>
+            </w:r>
+          </w:p>
+        </w:tc>
+        <w:tc>
+          <w:tcPr>
+            <w:tcW w:type="dxa" w:w="2073"/>
+          </w:tcPr>
+          <w:p>
+            <w:r>
+              <w:t>Nota del operador al marcar la alerta como atendida</w:t>
+            </w:r>
+          </w:p>
+        </w:tc>
+      </w:tr>
+    </w:tbl>
+    <w:p>
+      <w:pPr/>
+      <w:r>
+        <w:t>Tabla 15. Diccionario de datos de la colección alertas. Referencia la lectura que la originó y copia los límites vigentes en ese momento: si después se modifica el rango del perfil, la alerta conserva la referencia con la que se evaluó. Es un dato histórico, no una consulta al valor actual. Fuente: elaboración propia.</w:t>
+      </w:r>
+    </w:p>
+    <w:p>
+      <w:pPr/>
+      <w:r>
+        <w:t>Diccionario de datos — colección usuarios</w:t>
+      </w:r>
+    </w:p>
+    <w:tbl>
+      <w:tblPr>
+        <w:tblW w:type="auto" w:w="0"/>
+        <w:tblLook w:firstColumn="1" w:firstRow="1" w:lastColumn="0" w:lastRow="0" w:noHBand="0" w:noVBand="1" w:val="04A0"/>
+      </w:tblPr>
+      <w:tblGrid>
+        <w:gridCol w:w="2073"/>
+        <w:gridCol w:w="2073"/>
+        <w:gridCol w:w="2073"/>
+        <w:gridCol w:w="2073"/>
+        <w:gridCol w:w="2073"/>
+        <w:gridCol w:w="2073"/>
+      </w:tblGrid>
+      <w:tr>
+        <w:tc>
+          <w:tcPr>
+            <w:tcW w:type="dxa" w:w="2073"/>
+          </w:tcPr>
+          <w:p>
+            <w:r/>
+            <w:r>
+              <w:rPr>
+                <w:b/>
+              </w:rPr>
+              <w:t>Campo</w:t>
+            </w:r>
+          </w:p>
+        </w:tc>
+        <w:tc>
+          <w:tcPr>
+            <w:tcW w:type="dxa" w:w="2073"/>
+          </w:tcPr>
+          <w:p>
+            <w:r/>
+            <w:r>
+              <w:rPr>
+                <w:b/>
+              </w:rPr>
+              <w:t>Tipo</w:t>
+            </w:r>
+          </w:p>
+        </w:tc>
+        <w:tc>
+          <w:tcPr>
+            <w:tcW w:type="dxa" w:w="2073"/>
+          </w:tcPr>
+          <w:p>
+            <w:r/>
+            <w:r>
+              <w:rPr>
+                <w:b/>
+              </w:rPr>
+              <w:t>Longitud</w:t>
+            </w:r>
+          </w:p>
+        </w:tc>
+        <w:tc>
+          <w:tcPr>
+            <w:tcW w:type="dxa" w:w="2073"/>
+          </w:tcPr>
+          <w:p>
+            <w:r/>
+            <w:r>
+              <w:rPr>
+                <w:b/>
+              </w:rPr>
+              <w:t>Obligatorio</w:t>
+            </w:r>
+          </w:p>
+        </w:tc>
+        <w:tc>
+          <w:tcPr>
+            <w:tcW w:type="dxa" w:w="2073"/>
+          </w:tcPr>
+          <w:p>
+            <w:r/>
+            <w:r>
+              <w:rPr>
+                <w:b/>
+              </w:rPr>
+              <w:t>Restricción</w:t>
+            </w:r>
+          </w:p>
+        </w:tc>
+        <w:tc>
+          <w:tcPr>
+            <w:tcW w:type="dxa" w:w="2073"/>
+          </w:tcPr>
+          <w:p>
+            <w:r/>
+            <w:r>
+              <w:rPr>
+                <w:b/>
+              </w:rPr>
+              <w:t>Descripción</w:t>
+            </w:r>
+          </w:p>
+        </w:tc>
+      </w:tr>
+      <w:tr>
+        <w:tc>
+          <w:tcPr>
+            <w:tcW w:type="dxa" w:w="2073"/>
+          </w:tcPr>
+          <w:p>
+            <w:r>
+              <w:t>id</w:t>
+            </w:r>
+          </w:p>
+        </w:tc>
+        <w:tc>
+          <w:tcPr>
+            <w:tcW w:type="dxa" w:w="2073"/>
+          </w:tcPr>
+          <w:p>
+            <w:r>
+              <w:t>Texto</w:t>
+            </w:r>
+          </w:p>
+        </w:tc>
+        <w:tc>
+          <w:tcPr>
+            <w:tcW w:type="dxa" w:w="2073"/>
+          </w:tcPr>
+          <w:p>
+            <w:r>
+              <w:t>64</w:t>
+            </w:r>
+          </w:p>
+        </w:tc>
+        <w:tc>
+          <w:tcPr>
+            <w:tcW w:type="dxa" w:w="2073"/>
+          </w:tcPr>
+          <w:p>
+            <w:r>
+              <w:t>Sí</w:t>
+            </w:r>
+          </w:p>
+        </w:tc>
+        <w:tc>
+          <w:tcPr>
+            <w:tcW w:type="dxa" w:w="2073"/>
+          </w:tcPr>
+          <w:p>
+            <w:r>
+              <w:t>Igual al uid del proveedor de identidad</w:t>
+            </w:r>
+          </w:p>
+        </w:tc>
+        <w:tc>
+          <w:tcPr>
+            <w:tcW w:type="dxa" w:w="2073"/>
+          </w:tcPr>
+          <w:p>
+            <w:r>
+              <w:t>Identificador de la cuenta, emitido por Firebase Authentication</w:t>
+            </w:r>
+          </w:p>
+        </w:tc>
+      </w:tr>
+      <w:tr>
+        <w:tc>
+          <w:tcPr>
+            <w:tcW w:type="dxa" w:w="2073"/>
+          </w:tcPr>
+          <w:p>
+            <w:r>
+              <w:t>email</w:t>
+            </w:r>
+          </w:p>
+        </w:tc>
+        <w:tc>
+          <w:tcPr>
+            <w:tcW w:type="dxa" w:w="2073"/>
+          </w:tcPr>
+          <w:p>
+            <w:r>
+              <w:t>Texto</w:t>
+            </w:r>
+          </w:p>
+        </w:tc>
+        <w:tc>
+          <w:tcPr>
+            <w:tcW w:type="dxa" w:w="2073"/>
+          </w:tcPr>
+          <w:p>
+            <w:r>
+              <w:t>120</w:t>
+            </w:r>
+          </w:p>
+        </w:tc>
+        <w:tc>
+          <w:tcPr>
+            <w:tcW w:type="dxa" w:w="2073"/>
+          </w:tcPr>
+          <w:p>
+            <w:r>
+              <w:t>Sí</w:t>
+            </w:r>
+          </w:p>
+        </w:tc>
+        <w:tc>
+          <w:tcPr>
+            <w:tcW w:type="dxa" w:w="2073"/>
+          </w:tcPr>
+          <w:p>
+            <w:r>
+              <w:t>—</w:t>
+            </w:r>
+          </w:p>
+        </w:tc>
+        <w:tc>
+          <w:tcPr>
+            <w:tcW w:type="dxa" w:w="2073"/>
+          </w:tcPr>
+          <w:p>
+            <w:r>
+              <w:t>Correo con el que la cuenta inicia sesión</w:t>
+            </w:r>
+          </w:p>
+        </w:tc>
+      </w:tr>
+      <w:tr>
+        <w:tc>
+          <w:tcPr>
+            <w:tcW w:type="dxa" w:w="2073"/>
+          </w:tcPr>
+          <w:p>
+            <w:r>
+              <w:t>nombre</w:t>
+            </w:r>
+          </w:p>
+        </w:tc>
+        <w:tc>
+          <w:tcPr>
+            <w:tcW w:type="dxa" w:w="2073"/>
+          </w:tcPr>
+          <w:p>
+            <w:r>
+              <w:t>Texto</w:t>
+            </w:r>
+          </w:p>
+        </w:tc>
+        <w:tc>
+          <w:tcPr>
+            <w:tcW w:type="dxa" w:w="2073"/>
+          </w:tcPr>
+          <w:p>
+            <w:r>
+              <w:t>80</w:t>
+            </w:r>
+          </w:p>
+        </w:tc>
+        <w:tc>
+          <w:tcPr>
+            <w:tcW w:type="dxa" w:w="2073"/>
+          </w:tcPr>
+          <w:p>
+            <w:r>
+              <w:t>Sí</w:t>
+            </w:r>
+          </w:p>
+        </w:tc>
+        <w:tc>
+          <w:tcPr>
+            <w:tcW w:type="dxa" w:w="2073"/>
+          </w:tcPr>
+          <w:p>
+            <w:r>
+              <w:t>Entre 2 y 80 caracteres</w:t>
+            </w:r>
+          </w:p>
+        </w:tc>
+        <w:tc>
+          <w:tcPr>
+            <w:tcW w:type="dxa" w:w="2073"/>
+          </w:tcPr>
+          <w:p>
+            <w:r>
+              <w:t>Nombre de la persona responsable de la cuenta</w:t>
+            </w:r>
+          </w:p>
+        </w:tc>
+      </w:tr>
+      <w:tr>
+        <w:tc>
+          <w:tcPr>
+            <w:tcW w:type="dxa" w:w="2073"/>
+          </w:tcPr>
+          <w:p>
+            <w:r>
+              <w:t>rol</w:t>
+            </w:r>
+          </w:p>
+        </w:tc>
+        <w:tc>
+          <w:tcPr>
+            <w:tcW w:type="dxa" w:w="2073"/>
+          </w:tcPr>
+          <w:p>
+            <w:r>
+              <w:t>Texto</w:t>
+            </w:r>
+          </w:p>
+        </w:tc>
+        <w:tc>
+          <w:tcPr>
+            <w:tcW w:type="dxa" w:w="2073"/>
+          </w:tcPr>
+          <w:p>
+            <w:r>
+              <w:t>20</w:t>
+            </w:r>
+          </w:p>
+        </w:tc>
+        <w:tc>
+          <w:tcPr>
+            <w:tcW w:type="dxa" w:w="2073"/>
+          </w:tcPr>
+          <w:p>
+            <w:r>
+              <w:t>Sí</w:t>
+            </w:r>
+          </w:p>
+        </w:tc>
+        <w:tc>
+          <w:tcPr>
+            <w:tcW w:type="dxa" w:w="2073"/>
+          </w:tcPr>
+          <w:p>
+            <w:r>
+              <w:t>administrador u operador (dominio cerrado)</w:t>
+            </w:r>
+          </w:p>
+        </w:tc>
+        <w:tc>
+          <w:tcPr>
+            <w:tcW w:type="dxa" w:w="2073"/>
+          </w:tcPr>
+          <w:p>
+            <w:r>
+              <w:t>Rol que determina las operaciones habilitadas para la cuenta</w:t>
+            </w:r>
+          </w:p>
+        </w:tc>
+      </w:tr>
+      <w:tr>
+        <w:tc>
+          <w:tcPr>
+            <w:tcW w:type="dxa" w:w="2073"/>
+          </w:tcPr>
+          <w:p>
+            <w:r>
+              <w:t>activo</w:t>
+            </w:r>
+          </w:p>
+        </w:tc>
+        <w:tc>
+          <w:tcPr>
+            <w:tcW w:type="dxa" w:w="2073"/>
+          </w:tcPr>
+          <w:p>
+            <w:r>
+              <w:t>Booleano</w:t>
+            </w:r>
+          </w:p>
+        </w:tc>
+        <w:tc>
+          <w:tcPr>
+            <w:tcW w:type="dxa" w:w="2073"/>
+          </w:tcPr>
+          <w:p>
+            <w:r>
+              <w:t>—</w:t>
+            </w:r>
+          </w:p>
+        </w:tc>
+        <w:tc>
+          <w:tcPr>
+            <w:tcW w:type="dxa" w:w="2073"/>
+          </w:tcPr>
+          <w:p>
+            <w:r>
+              <w:t>Sí</w:t>
+            </w:r>
+          </w:p>
+        </w:tc>
+        <w:tc>
+          <w:tcPr>
+            <w:tcW w:type="dxa" w:w="2073"/>
+          </w:tcPr>
+          <w:p>
+            <w:r>
+              <w:t>Valor por defecto: verdadero</w:t>
+            </w:r>
+          </w:p>
+        </w:tc>
+        <w:tc>
+          <w:tcPr>
+            <w:tcW w:type="dxa" w:w="2073"/>
+          </w:tcPr>
+          <w:p>
+            <w:r>
+              <w:t>Una cuenta inactiva no puede operar sobre el sistema</w:t>
+            </w:r>
+          </w:p>
+        </w:tc>
+      </w:tr>
+      <w:tr>
+        <w:tc>
+          <w:tcPr>
+            <w:tcW w:type="dxa" w:w="2073"/>
+          </w:tcPr>
+          <w:p>
+            <w:r>
+              <w:t>telefono</w:t>
+            </w:r>
+          </w:p>
+        </w:tc>
+        <w:tc>
+          <w:tcPr>
+            <w:tcW w:type="dxa" w:w="2073"/>
+          </w:tcPr>
+          <w:p>
+            <w:r>
+              <w:t>Texto</w:t>
+            </w:r>
+          </w:p>
+        </w:tc>
+        <w:tc>
+          <w:tcPr>
+            <w:tcW w:type="dxa" w:w="2073"/>
+          </w:tcPr>
+          <w:p>
+            <w:r>
+              <w:t>30</w:t>
+            </w:r>
+          </w:p>
+        </w:tc>
+        <w:tc>
+          <w:tcPr>
+            <w:tcW w:type="dxa" w:w="2073"/>
+          </w:tcPr>
+          <w:p>
+            <w:r>
+              <w:t>No</w:t>
+            </w:r>
+          </w:p>
+        </w:tc>
+        <w:tc>
+          <w:tcPr>
+            <w:tcW w:type="dxa" w:w="2073"/>
+          </w:tcPr>
+          <w:p>
+            <w:r>
+              <w:t>—</w:t>
+            </w:r>
+          </w:p>
+        </w:tc>
+        <w:tc>
+          <w:tcPr>
+            <w:tcW w:type="dxa" w:w="2073"/>
+          </w:tcPr>
+          <w:p>
+            <w:r>
+              <w:t>Teléfono de contacto</w:t>
+            </w:r>
+          </w:p>
+        </w:tc>
+      </w:tr>
+      <w:tr>
+        <w:tc>
+          <w:tcPr>
+            <w:tcW w:type="dxa" w:w="2073"/>
+          </w:tcPr>
+          <w:p>
+            <w:r>
+              <w:t>cargo</w:t>
+            </w:r>
+          </w:p>
+        </w:tc>
+        <w:tc>
+          <w:tcPr>
+            <w:tcW w:type="dxa" w:w="2073"/>
+          </w:tcPr>
+          <w:p>
+            <w:r>
+              <w:t>Texto</w:t>
+            </w:r>
+          </w:p>
+        </w:tc>
+        <w:tc>
+          <w:tcPr>
+            <w:tcW w:type="dxa" w:w="2073"/>
+          </w:tcPr>
+          <w:p>
+            <w:r>
+              <w:t>60</w:t>
+            </w:r>
+          </w:p>
+        </w:tc>
+        <w:tc>
+          <w:tcPr>
+            <w:tcW w:type="dxa" w:w="2073"/>
+          </w:tcPr>
+          <w:p>
+            <w:r>
+              <w:t>No</w:t>
+            </w:r>
+          </w:p>
+        </w:tc>
+        <w:tc>
+          <w:tcPr>
+            <w:tcW w:type="dxa" w:w="2073"/>
+          </w:tcPr>
+          <w:p>
+            <w:r>
+              <w:t>—</w:t>
+            </w:r>
+          </w:p>
+        </w:tc>
+        <w:tc>
+          <w:tcPr>
+            <w:tcW w:type="dxa" w:w="2073"/>
+          </w:tcPr>
+          <w:p>
+            <w:r>
+              <w:t>Cargo o función dentro del cultivo</w:t>
+            </w:r>
+          </w:p>
+        </w:tc>
+      </w:tr>
+    </w:tbl>
+    <w:p>
+      <w:pPr/>
+      <w:r>
+        <w:t>Tabla 16. Diccionario de datos de la colección usuarios. Guarda el perfil de la cuenta. El identificador del documento es el mismo uid que emite el proveedor de identidad, de modo que la autorización resuelve el rol sin una consulta adicional por correo. Fuente: elaboración propia.</w:t>
       </w:r>
     </w:p>
     <w:p>
@@ -11479,7 +14209,7 @@
           <w:sz w:val="20"/>
           <w:szCs w:val="20"/>
         </w:rPr>
-        <w:t>Tabla 12. Contrato de la API. Fuente: elaboración propia.</w:t>
+        <w:t>Tabla 17. Contrato de la API. Fuente: elaboración propia.</w:t>
       </w:r>
     </w:p>
     <w:p>
@@ -12250,7 +14980,7 @@
           <w:sz w:val="20"/>
           <w:szCs w:val="20"/>
         </w:rPr>
-        <w:t xml:space="preserve">Tabla 13. </w:t>
+        <w:t xml:space="preserve">Tabla 18. </w:t>
       </w:r>
       <w:proofErr w:type="spellStart"/>
       <w:r>
@@ -12662,7 +15392,7 @@
         <w:t xml:space="preserve">    """Devuelve el estado de una lectura respecto de su rango de referencia.</w:t>
         <w:br/>
         <w:br/>
-        <w:t xml:space="preserve">    Si no hay rango configurado para la variable, el estado es `sin_rango`:</w:t>
+        <w:t xml:space="preserve">    Si no hay rango configurado para la variable, el estado es sin_rango:</w:t>
         <w:br/>
         <w:t xml:space="preserve">    la ausencia de referencia no es un valor fuera de rango.</w:t>
         <w:br/>
@@ -12921,7 +15651,7 @@
         <w:rPr>
           <w:b w:val="0"/>
         </w:rPr>
-        <w:t>Tabla 14. Cuentas habilitadas para la evaluación del entregable. Fuente: elaboración propia.</w:t>
+        <w:t>Tabla 19. Cuentas habilitadas para la evaluación del entregable. Fuente: elaboración propia.</w:t>
       </w:r>
     </w:p>
   </w:body>

</xml_diff>

<commit_message>
docs(e2): actualizar el tablero Kanban del entregable a la Semana 3
La Figura 1 del entregable mostraba el tablero al cierre de la Semana 1 —once tarjetas terminadas— mientras su pie decia Semana 2: el generador del E2 cambiaba la palabra pero nunca volvia a dibujar la imagen. La figura se regenera desde el tablero y el pie se escribe con la semana que la figura muestra: ahora son treinta tarjetas terminadas.

El tablero tenia la tarea T-29 en dos columnas a la vez —En curso y Hecho de la Semana 3—, de modo que sus columnas sumaban 37 tarjetas sobre 36 tareas. Queda en En curso, que es su estado real mientras la entrega no se suba al aula virtual, y el resumen pasa a 30 terminadas, 2 en curso y 4 en el backlog.

Se corrige ademas la cifra de pruebas que declaraba el apartado 2.6: eran 186 (106 del servicio y 80 de la aplicacion) y son 199 (106 y 93).
</commit_message>
<xml_diff>
--- a/docs/Santos_Perfil_Proyecto_E2.docx
+++ b/docs/Santos_Perfil_Proyecto_E2.docx
@@ -3226,7 +3226,7 @@
           <w:sz w:val="20"/>
           <w:szCs w:val="20"/>
         </w:rPr>
-        <w:t>Figura 1. Tablero de tareas al cierre de la Semana 2. Fuente: elaboración propia.</w:t>
+        <w:t>Figura 1. Tablero de tareas al cierre de la Semana 3. Fuente: elaboración propia.</w:t>
       </w:r>
     </w:p>
     <w:p>
@@ -15492,7 +15492,7 @@
         <w:rPr>
           <w:b w:val="0"/>
         </w:rPr>
-        <w:t>La verificación se sostiene en ciento ochenta y seis pruebas automatizadas —ciento seis del servicio y ochenta de la aplicación— que se ejecutan sin credenciales ni conexión, y en los ensayos de campo del módulo de adquisición consignados en el apartado 2.8, cuyos registros se conservan en el repositorio.</w:t>
+        <w:t>La verificación se sostiene en ciento noventa y nueve pruebas automatizadas —ciento seis del servicio y noventa y tres de la aplicación— que se ejecutan sin credenciales ni conexión, y en los ensayos de campo del módulo de adquisición consignados en el apartado 2.8, cuyos registros se conservan en el repositorio.</w:t>
       </w:r>
     </w:p>
     <w:p>

</xml_diff>